<commit_message>
HH Global materials after honesty check
Co-Authored-By: Claude Opus 5.5 <noreply@anthropic.com>
Claude-Session: https://claude.ai/code/session_01VpCXqDFSAKkK8y6mKL2HCw
</commit_message>
<xml_diff>
--- a/applications/hh-global-creative-operations-manager/build/Joshua_Chappell_CoverLetter_HHGlobal.docx
+++ b/applications/hh-global-creative-operations-manager/build/Joshua_Chappell_CoverLetter_HHGlobal.docx
@@ -27,7 +27,7 @@
         </w:rPr>
         <w:t xml:space="preserve">Mesa, AZ  •  480-586-7959  •  </w:t>
       </w:r>
-      <w:hyperlink w:history="1" r:id="rId07hahaivyyniouh5_asxz">
+      <w:hyperlink w:history="1" r:id="rIdmdp46kasotxhc1jgf1gdg">
         <w:r>
           <w:rPr>
             <w:rFonts w:ascii="Calibri" w:cs="Calibri" w:eastAsia="Calibri" w:hAnsi="Calibri"/>
@@ -47,7 +47,7 @@
         </w:rPr>
         <w:t xml:space="preserve">  •  </w:t>
       </w:r>
-      <w:hyperlink w:history="1" r:id="rIdo4f7zppdnvf_vy7mfygob">
+      <w:hyperlink w:history="1" r:id="rIdvuljniytdxadgkmabfsnj">
         <w:r>
           <w:rPr>
             <w:rFonts w:ascii="Calibri" w:cs="Calibri" w:eastAsia="Calibri" w:hAnsi="Calibri"/>
@@ -67,7 +67,7 @@
         </w:rPr>
         <w:t xml:space="preserve">  •  </w:t>
       </w:r>
-      <w:hyperlink w:history="1" r:id="rIdwbx6rjbactuhs8xnr-v2a">
+      <w:hyperlink w:history="1" r:id="rIdlurde3rstr6jwu1osc96h">
         <w:r>
           <w:rPr>
             <w:rFonts w:ascii="Calibri" w:cs="Calibri" w:eastAsia="Calibri" w:hAnsi="Calibri"/>
@@ -87,7 +87,7 @@
         </w:rPr>
         <w:t xml:space="preserve">  •  </w:t>
       </w:r>
-      <w:hyperlink w:history="1" r:id="rId10h0ux13uetr-wrxlocnx">
+      <w:hyperlink w:history="1" r:id="rIdg4b8eowkx5covnbcsjgzp">
         <w:r>
           <w:rPr>
             <w:rFonts w:ascii="Calibri" w:cs="Calibri" w:eastAsia="Calibri" w:hAnsi="Calibri"/>
@@ -138,7 +138,7 @@
           <w:sz w:val="22"/>
           <w:szCs w:val="22"/>
         </w:rPr>
-        <w:t xml:space="preserve">Your posting puts AI tool rollout and automation at the center of this role. That is the work I do every day. At Charter One I used Claude agentic coding to develop content workflows that cut production times in half while keeping stories authentic. At Lightbox Digital I slashed creative production times by 30% with AI tools and built a complete AI video workflow in Google Veo, Kling, and Midjourney. You get someone who can put new tools in front of a creative team, prove the time savings, and keep the quality bar where the client expects it.</w:t>
+        <w:t xml:space="preserve">Your posting puts AI tool rollout and automation at the center of this role. At Charter One I used Claude agentic coding to develop content workflows that cut production times in half while keeping stories authentic. At Lightbox Digital I slashed creative production times by 30% with AI tools and built a complete AI video workflow in Google Veo, Kling, and Midjourney. You get someone who has built AI into real production and measured the time it saves.</w:t>
       </w:r>
     </w:p>
     <w:p>
@@ -152,7 +152,7 @@
           <w:sz w:val="22"/>
           <w:szCs w:val="22"/>
         </w:rPr>
-        <w:t xml:space="preserve">The operations side is familiar ground. I have delivered 98% of projects on time and 92% within budget while commanding crews of 5 to 20 people. I maintained an organized library of video assets in Frame.io and Dropbox, reducing search and retrieval time by over 50%, which is the same discipline a DAM system needs. At Grand Canyon Education, one of the largest marketing agencies in the country, I delivered 200+ videos over two years reaching millions on TV, paid social, and organic channels, and crystallized scope of work so cross-department stakeholder goals were met and exceeded. I manage projects in Wrike, Notion, and Google Workspace, and my post-production runs on Adobe Creative Cloud.</w:t>
+        <w:t xml:space="preserve">The production side is familiar ground. I have delivered 98% of projects on time and 92% within budget while commanding crews of 5 to 20 people. I maintained an organized library of video assets in Frame.io and Dropbox, reducing search and retrieval time by over 50%, which is the same discipline a DAM system needs. At Grand Canyon Education, one of the largest marketing agencies in the country, I delivered 200+ videos over two years reaching millions on TV, paid social, and organic channels, and crystallized scope of work so cross-department stakeholder goals were met and exceeded. I manage projects in Wrike, Notion, and Google Workspace, and my post-production runs on Adobe Creative Cloud and DaVinci Resolve.</w:t>
       </w:r>
     </w:p>
     <w:p>

</xml_diff>